<commit_message>
Update academic document template
Refreshes the doc_3 Word template used for academic document generation. This update aligns the template with the latest required formatting and content for generated academic documents.
</commit_message>
<xml_diff>
--- a/HRCP-KKU-Academic/src/main/resources/templates/docx/doc_3.docx
+++ b/HRCP-KKU-Academic/src/main/resources/templates/docx/doc_3.docx
@@ -1,6 +1,6 @@
 
 <file path=word/document.xml><?xml version="1.0" encoding="utf-8"?>
-<w:document xmlns:wpc="http://schemas.microsoft.com/office/word/2010/wordprocessingCanvas" xmlns:cx="http://schemas.microsoft.com/office/drawing/2014/chartex" xmlns:cx1="http://schemas.microsoft.com/office/drawing/2015/9/8/chartex" xmlns:cx2="http://schemas.microsoft.com/office/drawing/2015/10/21/chartex" xmlns:cx3="http://schemas.microsoft.com/office/drawing/2016/5/9/chartex" xmlns:cx4="http://schemas.microsoft.com/office/drawing/2016/5/10/chartex" xmlns:cx5="http://schemas.microsoft.com/office/drawing/2016/5/11/chartex" xmlns:cx6="http://schemas.microsoft.com/office/drawing/2016/5/12/chartex" xmlns:cx7="http://schemas.microsoft.com/office/drawing/2016/5/13/chartex" xmlns:cx8="http://schemas.microsoft.com/office/drawing/2016/5/14/chartex" xmlns:mc="http://schemas.openxmlformats.org/markup-compatibility/2006" xmlns:m="http://schemas.openxmlformats.org/officeDocument/2006/math" xmlns:aink="http://schemas.microsoft.com/office/drawing/2016/ink" xmlns:am3d="http://schemas.microsoft.com/office/drawing/2017/model3d" xmlns:oel="http://schemas.microsoft.com/office/2019/extlst" xmlns:r="http://schemas.openxmlformats.org/officeDocument/2006/relationships" xmlns:wp14="http://schemas.microsoft.com/office/word/2010/wordprocessingDrawing" xmlns:wp="http://schemas.openxmlformats.org/drawingml/2006/wordprocessingDrawing" xmlns:wpg="http://schemas.microsoft.com/office/word/2010/wordprocessingGroup" xmlns:wpi="http://schemas.microsoft.com/office/word/2010/wordprocessingInk" xmlns:wps="http://schemas.microsoft.com/office/word/2010/wordprocessingShape" xmlns:o="urn:schemas-microsoft-com:office:office" xmlns:v="urn:schemas-microsoft-com:vml" xmlns:w10="urn:schemas-microsoft-com:office:word" xmlns:w="http://schemas.openxmlformats.org/wordprocessingml/2006/main" xmlns:w14="http://schemas.microsoft.com/office/word/2010/wordml" xmlns:w15="http://schemas.microsoft.com/office/word/2012/wordml" xmlns:w16cex="http://schemas.microsoft.com/office/word/2018/wordml/cex" xmlns:w16cid="http://schemas.microsoft.com/office/word/2016/wordml/cid" xmlns:w16="http://schemas.microsoft.com/office/word/2018/wordml" xmlns:w16sdtdh="http://schemas.microsoft.com/office/word/2020/wordml/sdtdatahash" xmlns:w16sdtfl="http://schemas.microsoft.com/office/word/2024/wordml/sdtformatlock" xmlns:w16se="http://schemas.microsoft.com/office/word/2015/wordml/symex" xmlns:w16du="http://schemas.microsoft.com/office/word/2023/wordml/word16du" xmlns:wne="http://schemas.microsoft.com/office/word/2006/wordml" mc:Ignorable="w14 w15 w16se w16cid w16 w16cex w16sdtdh w16sdtfl w16du wp14">
+<w:document xmlns:wpc="http://schemas.microsoft.com/office/word/2010/wordprocessingCanvas" xmlns:cx="http://schemas.microsoft.com/office/drawing/2014/chartex" xmlns:cx1="http://schemas.microsoft.com/office/drawing/2015/9/8/chartex" xmlns:cx2="http://schemas.microsoft.com/office/drawing/2015/10/21/chartex" xmlns:cx3="http://schemas.microsoft.com/office/drawing/2016/5/9/chartex" xmlns:cx4="http://schemas.microsoft.com/office/drawing/2016/5/10/chartex" xmlns:cx5="http://schemas.microsoft.com/office/drawing/2016/5/11/chartex" xmlns:cx6="http://schemas.microsoft.com/office/drawing/2016/5/12/chartex" xmlns:cx7="http://schemas.microsoft.com/office/drawing/2016/5/13/chartex" xmlns:cx8="http://schemas.microsoft.com/office/drawing/2016/5/14/chartex" xmlns:mc="http://schemas.openxmlformats.org/markup-compatibility/2006" xmlns:aink="http://schemas.microsoft.com/office/drawing/2016/ink" xmlns:am3d="http://schemas.microsoft.com/office/drawing/2017/model3d" xmlns:o="urn:schemas-microsoft-com:office:office" xmlns:oel="http://schemas.microsoft.com/office/2019/extlst" xmlns:r="http://schemas.openxmlformats.org/officeDocument/2006/relationships" xmlns:m="http://schemas.openxmlformats.org/officeDocument/2006/math" xmlns:v="urn:schemas-microsoft-com:vml" xmlns:wp14="http://schemas.microsoft.com/office/word/2010/wordprocessingDrawing" xmlns:wp="http://schemas.openxmlformats.org/drawingml/2006/wordprocessingDrawing" xmlns:w10="urn:schemas-microsoft-com:office:word" xmlns:w="http://schemas.openxmlformats.org/wordprocessingml/2006/main" xmlns:w14="http://schemas.microsoft.com/office/word/2010/wordml" xmlns:w15="http://schemas.microsoft.com/office/word/2012/wordml" xmlns:w16cex="http://schemas.microsoft.com/office/word/2018/wordml/cex" xmlns:w16cid="http://schemas.microsoft.com/office/word/2016/wordml/cid" xmlns:w16="http://schemas.microsoft.com/office/word/2018/wordml" xmlns:w16du="http://schemas.microsoft.com/office/word/2023/wordml/word16du" xmlns:w16sdtdh="http://schemas.microsoft.com/office/word/2020/wordml/sdtdatahash" xmlns:w16sdtfl="http://schemas.microsoft.com/office/word/2024/wordml/sdtformatlock" xmlns:w16se="http://schemas.microsoft.com/office/word/2015/wordml/symex" xmlns:wpg="http://schemas.microsoft.com/office/word/2010/wordprocessingGroup" xmlns:wpi="http://schemas.microsoft.com/office/word/2010/wordprocessingInk" xmlns:wne="http://schemas.microsoft.com/office/word/2006/wordml" xmlns:wps="http://schemas.microsoft.com/office/word/2010/wordprocessingShape" mc:Ignorable="w14 w15 w16se w16cid w16 w16cex w16sdtdh w16sdtfl w16du wp14">
   <w:body>
     <w:tbl>
       <w:tblPr>
@@ -123,6 +123,7 @@
                 <w:rFonts w:ascii="TH Sarabun New" w:eastAsia="Times New Roman" w:hAnsi="TH Sarabun New" w:cs="TH Sarabun New"/>
                 <w:sz w:val="28"/>
                 <w:szCs w:val="28"/>
+                <w:cs/>
                 <w:lang w:val="en-US" w:eastAsia="en-GB"/>
               </w:rPr>
             </w:pPr>
@@ -182,37 +183,6 @@
               </w:rPr>
               <w:t xml:space="preserve"> )  เพื่อโปรดพิจารณา </w:t>
             </w:r>
-          </w:p>
-          <w:p>
-            <w:pPr>
-              <w:rPr>
-                <w:rFonts w:ascii="TH Sarabun New" w:eastAsia="Times New Roman" w:hAnsi="TH Sarabun New" w:cs="TH Sarabun New"/>
-                <w:sz w:val="28"/>
-                <w:szCs w:val="28"/>
-                <w:lang w:val="en-US" w:eastAsia="en-GB"/>
-              </w:rPr>
-            </w:pPr>
-          </w:p>
-          <w:p>
-            <w:pPr>
-              <w:rPr>
-                <w:rFonts w:ascii="TH Sarabun New" w:eastAsia="Times New Roman" w:hAnsi="TH Sarabun New" w:cs="TH Sarabun New"/>
-                <w:sz w:val="28"/>
-                <w:szCs w:val="28"/>
-                <w:lang w:val="en-US" w:eastAsia="en-GB"/>
-              </w:rPr>
-            </w:pPr>
-          </w:p>
-          <w:p>
-            <w:pPr>
-              <w:rPr>
-                <w:rFonts w:ascii="TH Sarabun New" w:eastAsia="Times New Roman" w:hAnsi="TH Sarabun New" w:cs="TH Sarabun New"/>
-                <w:sz w:val="28"/>
-                <w:szCs w:val="28"/>
-                <w:cs/>
-                <w:lang w:val="en-US" w:eastAsia="en-GB"/>
-              </w:rPr>
-            </w:pPr>
           </w:p>
           <w:p>
             <w:pPr>
@@ -243,7 +213,6 @@
               </w:rPr>
               <w:t>{{</w:t>
             </w:r>
-            <w:proofErr w:type="spellStart"/>
             <w:r>
               <w:rPr>
                 <w:rFonts w:ascii="TH Sarabun New" w:eastAsia="Times New Roman" w:hAnsi="TH Sarabun New" w:cs="TH Sarabun New"/>
@@ -262,7 +231,6 @@
               </w:rPr>
               <w:t>dean_name</w:t>
             </w:r>
-            <w:proofErr w:type="spellEnd"/>
             <w:r>
               <w:rPr>
                 <w:rFonts w:ascii="TH Sarabun New" w:eastAsia="Times New Roman" w:hAnsi="TH Sarabun New" w:cs="TH Sarabun New"/>
@@ -314,7 +282,6 @@
               </w:rPr>
               <w:t>{{</w:t>
             </w:r>
-            <w:proofErr w:type="spellStart"/>
             <w:r>
               <w:rPr>
                 <w:rFonts w:ascii="TH Sarabun New" w:eastAsia="Times New Roman" w:hAnsi="TH Sarabun New" w:cs="TH Sarabun New"/>
@@ -342,7 +309,6 @@
               </w:rPr>
               <w:t>Dean</w:t>
             </w:r>
-            <w:proofErr w:type="spellEnd"/>
             <w:r>
               <w:rPr>
                 <w:rFonts w:ascii="TH Sarabun New" w:eastAsia="Times New Roman" w:hAnsi="TH Sarabun New" w:cs="TH Sarabun New"/>
@@ -362,7 +328,7 @@
             <w:pPr>
               <w:jc w:val="thaiDistribute"/>
               <w:rPr>
-                <w:rFonts w:ascii="TH Sarabun New" w:eastAsia="Times New Roman" w:hAnsi="TH Sarabun New" w:cs="TH Sarabun New"/>
+                <w:rFonts w:ascii="TH Sarabun New" w:eastAsia="Times New Roman" w:hAnsi="TH Sarabun New" w:cs="TH Sarabun New" w:hint="cs"/>
                 <w:sz w:val="28"/>
                 <w:szCs w:val="28"/>
                 <w:lang w:val="en-US" w:eastAsia="en-GB"/>
@@ -387,7 +353,6 @@
               </w:rPr>
               <w:t>{{</w:t>
             </w:r>
-            <w:proofErr w:type="spellStart"/>
             <w:r>
               <w:rPr>
                 <w:rFonts w:ascii="TH Sarabun New" w:eastAsia="Times New Roman" w:hAnsi="TH Sarabun New" w:cs="TH Sarabun New"/>
@@ -397,7 +362,6 @@
               </w:rPr>
               <w:t>chk_hr_verify</w:t>
             </w:r>
-            <w:proofErr w:type="spellEnd"/>
             <w:r>
               <w:rPr>
                 <w:rFonts w:ascii="TH Sarabun New" w:eastAsia="Times New Roman" w:hAnsi="TH Sarabun New" w:cs="TH Sarabun New"/>
@@ -417,16 +381,6 @@
               </w:rPr>
               <w:t xml:space="preserve">  )  เห็นควรแต่งตั้งคณะอนุกรรมการประเมินผลการสอนและนัดวันประเมินผลการสอนต่อไป</w:t>
             </w:r>
-          </w:p>
-          <w:p>
-            <w:pPr>
-              <w:rPr>
-                <w:rFonts w:ascii="TH Sarabun New" w:eastAsia="Times New Roman" w:hAnsi="TH Sarabun New" w:cs="TH Sarabun New"/>
-                <w:sz w:val="28"/>
-                <w:szCs w:val="28"/>
-                <w:lang w:val="en-US" w:eastAsia="en-GB"/>
-              </w:rPr>
-            </w:pPr>
           </w:p>
           <w:p>
             <w:pPr>
@@ -447,7 +401,44 @@
                 <w:cs/>
                 <w:lang w:val="en-US" w:eastAsia="en-GB"/>
               </w:rPr>
-              <w:t>..................................................................</w:t>
+              <w:t>(</w:t>
+            </w:r>
+            <w:r>
+              <w:rPr>
+                <w:rFonts w:ascii="TH Sarabun New" w:eastAsia="Times New Roman" w:hAnsi="TH Sarabun New" w:cs="TH Sarabun New"/>
+                <w:sz w:val="28"/>
+                <w:szCs w:val="28"/>
+                <w:lang w:val="en-US" w:eastAsia="en-GB"/>
+              </w:rPr>
+              <w:t>{{</w:t>
+            </w:r>
+            <w:r>
+              <w:rPr>
+                <w:rFonts w:ascii="TH Sarabun New" w:eastAsia="Times New Roman" w:hAnsi="TH Sarabun New" w:cs="TH Sarabun New"/>
+                <w:sz w:val="28"/>
+                <w:szCs w:val="28"/>
+                <w:lang w:val="en-US" w:eastAsia="en-GB"/>
+              </w:rPr>
+              <w:t>hr_staff_name</w:t>
+            </w:r>
+            <w:r>
+              <w:rPr>
+                <w:rFonts w:ascii="TH Sarabun New" w:eastAsia="Times New Roman" w:hAnsi="TH Sarabun New" w:cs="TH Sarabun New"/>
+                <w:sz w:val="28"/>
+                <w:szCs w:val="28"/>
+                <w:lang w:val="en-US" w:eastAsia="en-GB"/>
+              </w:rPr>
+              <w:t>}}</w:t>
+            </w:r>
+            <w:r>
+              <w:rPr>
+                <w:rFonts w:ascii="TH Sarabun New" w:eastAsia="Times New Roman" w:hAnsi="TH Sarabun New" w:cs="TH Sarabun New" w:hint="cs"/>
+                <w:sz w:val="28"/>
+                <w:szCs w:val="28"/>
+                <w:cs/>
+                <w:lang w:val="en-US" w:eastAsia="en-GB"/>
+              </w:rPr>
+              <w:t>)</w:t>
             </w:r>
           </w:p>
           <w:p>
@@ -463,16 +454,6 @@
             </w:pPr>
             <w:r>
               <w:rPr>
-                <w:rFonts w:ascii="TH Sarabun New" w:eastAsia="Times New Roman" w:hAnsi="TH Sarabun New" w:cs="TH Sarabun New" w:hint="cs"/>
-                <w:sz w:val="28"/>
-                <w:szCs w:val="28"/>
-                <w:cs/>
-                <w:lang w:val="en-US" w:eastAsia="en-GB"/>
-              </w:rPr>
-              <w:t>(</w:t>
-            </w:r>
-            <w:r>
-              <w:rPr>
                 <w:rFonts w:ascii="TH Sarabun New" w:eastAsia="Times New Roman" w:hAnsi="TH Sarabun New" w:cs="TH Sarabun New"/>
                 <w:sz w:val="28"/>
                 <w:szCs w:val="28"/>
@@ -480,58 +461,6 @@
               </w:rPr>
               <w:t>{{</w:t>
             </w:r>
-            <w:proofErr w:type="spellStart"/>
-            <w:r>
-              <w:rPr>
-                <w:rFonts w:ascii="TH Sarabun New" w:eastAsia="Times New Roman" w:hAnsi="TH Sarabun New" w:cs="TH Sarabun New"/>
-                <w:sz w:val="28"/>
-                <w:szCs w:val="28"/>
-                <w:lang w:val="en-US" w:eastAsia="en-GB"/>
-              </w:rPr>
-              <w:t>hr_staff_name</w:t>
-            </w:r>
-            <w:proofErr w:type="spellEnd"/>
-            <w:r>
-              <w:rPr>
-                <w:rFonts w:ascii="TH Sarabun New" w:eastAsia="Times New Roman" w:hAnsi="TH Sarabun New" w:cs="TH Sarabun New"/>
-                <w:sz w:val="28"/>
-                <w:szCs w:val="28"/>
-                <w:lang w:val="en-US" w:eastAsia="en-GB"/>
-              </w:rPr>
-              <w:t>}}</w:t>
-            </w:r>
-            <w:r>
-              <w:rPr>
-                <w:rFonts w:ascii="TH Sarabun New" w:eastAsia="Times New Roman" w:hAnsi="TH Sarabun New" w:cs="TH Sarabun New" w:hint="cs"/>
-                <w:sz w:val="28"/>
-                <w:szCs w:val="28"/>
-                <w:cs/>
-                <w:lang w:val="en-US" w:eastAsia="en-GB"/>
-              </w:rPr>
-              <w:t>)</w:t>
-            </w:r>
-          </w:p>
-          <w:p>
-            <w:pPr>
-              <w:ind w:right="288"/>
-              <w:jc w:val="center"/>
-              <w:rPr>
-                <w:rFonts w:ascii="TH Sarabun New" w:eastAsia="Times New Roman" w:hAnsi="TH Sarabun New" w:cs="TH Sarabun New"/>
-                <w:sz w:val="28"/>
-                <w:szCs w:val="28"/>
-                <w:lang w:val="en-US" w:eastAsia="en-GB"/>
-              </w:rPr>
-            </w:pPr>
-            <w:r>
-              <w:rPr>
-                <w:rFonts w:ascii="TH Sarabun New" w:eastAsia="Times New Roman" w:hAnsi="TH Sarabun New" w:cs="TH Sarabun New"/>
-                <w:sz w:val="28"/>
-                <w:szCs w:val="28"/>
-                <w:lang w:val="en-US" w:eastAsia="en-GB"/>
-              </w:rPr>
-              <w:t>{{</w:t>
-            </w:r>
-            <w:proofErr w:type="spellStart"/>
             <w:r>
               <w:rPr>
                 <w:rFonts w:ascii="TH Sarabun New" w:eastAsia="Times New Roman" w:hAnsi="TH Sarabun New" w:cs="TH Sarabun New"/>
@@ -541,7 +470,6 @@
               </w:rPr>
               <w:t>dropdownHr</w:t>
             </w:r>
-            <w:proofErr w:type="spellEnd"/>
             <w:r>
               <w:rPr>
                 <w:rFonts w:ascii="TH Sarabun New" w:eastAsia="Times New Roman" w:hAnsi="TH Sarabun New" w:cs="TH Sarabun New"/>
@@ -1040,7 +968,6 @@
               </w:rPr>
               <w:t>{{</w:t>
             </w:r>
-            <w:proofErr w:type="spellStart"/>
             <w:r>
               <w:rPr>
                 <w:rFonts w:ascii="TH Sarabun New" w:eastAsia="Times New Roman" w:hAnsi="TH Sarabun New" w:cs="TH Sarabun New"/>
@@ -1050,7 +977,6 @@
               </w:rPr>
               <w:t>chk_cs_head</w:t>
             </w:r>
-            <w:proofErr w:type="spellEnd"/>
             <w:r>
               <w:rPr>
                 <w:rFonts w:ascii="TH Sarabun New" w:eastAsia="Times New Roman" w:hAnsi="TH Sarabun New" w:cs="TH Sarabun New"/>
@@ -1110,7 +1036,6 @@
               </w:rPr>
               <w:t>{{</w:t>
             </w:r>
-            <w:proofErr w:type="spellStart"/>
             <w:r>
               <w:rPr>
                 <w:rFonts w:ascii="TH Sarabun New" w:eastAsia="Times New Roman" w:hAnsi="TH Sarabun New" w:cs="TH Sarabun New"/>
@@ -1120,7 +1045,6 @@
               </w:rPr>
               <w:t>chk_cs_head</w:t>
             </w:r>
-            <w:proofErr w:type="spellEnd"/>
             <w:r>
               <w:rPr>
                 <w:rFonts w:ascii="TH Sarabun New" w:eastAsia="Times New Roman" w:hAnsi="TH Sarabun New" w:cs="TH Sarabun New"/>
@@ -1404,16 +1328,6 @@
               </w:rPr>
               <w:t>อนุกรรมการและเลาขานุการ (ภายใน)</w:t>
             </w:r>
-          </w:p>
-          <w:p>
-            <w:pPr>
-              <w:rPr>
-                <w:rFonts w:ascii="TH Sarabun New" w:eastAsia="Times New Roman" w:hAnsi="TH Sarabun New" w:cs="TH Sarabun New"/>
-                <w:sz w:val="28"/>
-                <w:szCs w:val="28"/>
-                <w:lang w:val="en-US" w:eastAsia="en-GB"/>
-              </w:rPr>
-            </w:pPr>
           </w:p>
           <w:p>
             <w:pPr>
@@ -1444,7 +1358,6 @@
               </w:rPr>
               <w:t>{{</w:t>
             </w:r>
-            <w:proofErr w:type="spellStart"/>
             <w:r>
               <w:rPr>
                 <w:rFonts w:ascii="TH Sarabun New" w:eastAsia="Times New Roman" w:hAnsi="TH Sarabun New" w:cs="TH Sarabun New"/>
@@ -1454,7 +1367,6 @@
               </w:rPr>
               <w:t>department_head</w:t>
             </w:r>
-            <w:proofErr w:type="spellEnd"/>
             <w:r>
               <w:rPr>
                 <w:rFonts w:ascii="TH Sarabun New" w:eastAsia="Times New Roman" w:hAnsi="TH Sarabun New" w:cs="TH Sarabun New"/>
@@ -1492,27 +1404,7 @@
                 <w:szCs w:val="28"/>
                 <w:lang w:val="en-US" w:eastAsia="en-GB"/>
               </w:rPr>
-              <w:t>{{</w:t>
-            </w:r>
-            <w:proofErr w:type="spellStart"/>
-            <w:r>
-              <w:rPr>
-                <w:rFonts w:ascii="TH Sarabun New" w:eastAsia="Times New Roman" w:hAnsi="TH Sarabun New" w:cs="TH Sarabun New"/>
-                <w:sz w:val="28"/>
-                <w:szCs w:val="28"/>
-                <w:lang w:val="en-US" w:eastAsia="en-GB"/>
-              </w:rPr>
-              <w:t>dropdownCsHead</w:t>
-            </w:r>
-            <w:proofErr w:type="spellEnd"/>
-            <w:r>
-              <w:rPr>
-                <w:rFonts w:ascii="TH Sarabun New" w:eastAsia="Times New Roman" w:hAnsi="TH Sarabun New" w:cs="TH Sarabun New"/>
-                <w:sz w:val="28"/>
-                <w:szCs w:val="28"/>
-                <w:lang w:val="en-US" w:eastAsia="en-GB"/>
-              </w:rPr>
-              <w:t>}}</w:t>
+              <w:t>{{dropdownCsHead}}</w:t>
             </w:r>
           </w:p>
         </w:tc>
@@ -1606,7 +1498,6 @@
                 <w:lang w:val="en-US" w:eastAsia="en-GB"/>
               </w:rPr>
             </w:pPr>
-            <w:proofErr w:type="gramStart"/>
             <w:r>
               <w:rPr>
                 <w:rFonts w:ascii="TH Sarabun New" w:eastAsia="Times New Roman" w:hAnsi="TH Sarabun New" w:cs="TH Sarabun New"/>
@@ -1632,17 +1523,7 @@
                 <w:szCs w:val="28"/>
                 <w:lang w:val="en-US" w:eastAsia="en-GB"/>
               </w:rPr>
-              <w:t>{</w:t>
-            </w:r>
-            <w:proofErr w:type="gramEnd"/>
-            <w:r>
-              <w:rPr>
-                <w:rFonts w:ascii="TH Sarabun New" w:eastAsia="Times New Roman" w:hAnsi="TH Sarabun New" w:cs="TH Sarabun New"/>
-                <w:sz w:val="28"/>
-                <w:szCs w:val="28"/>
-                <w:lang w:val="en-US" w:eastAsia="en-GB"/>
-              </w:rPr>
-              <w:t>{</w:t>
+              <w:t>{{</w:t>
             </w:r>
             <w:r>
               <w:rPr>
@@ -1669,17 +1550,7 @@
                 <w:szCs w:val="28"/>
                 <w:lang w:val="en-US" w:eastAsia="en-GB"/>
               </w:rPr>
-              <w:t>}</w:t>
-            </w:r>
-            <w:proofErr w:type="gramStart"/>
-            <w:r>
-              <w:rPr>
-                <w:rFonts w:ascii="TH Sarabun New" w:eastAsia="Times New Roman" w:hAnsi="TH Sarabun New" w:cs="TH Sarabun New"/>
-                <w:sz w:val="28"/>
-                <w:szCs w:val="28"/>
-                <w:lang w:val="en-US" w:eastAsia="en-GB"/>
-              </w:rPr>
-              <w:t>}</w:t>
+              <w:t>}}</w:t>
             </w:r>
             <w:r>
               <w:rPr>
@@ -1695,7 +1566,6 @@
               </w:rPr>
               <w:t>)</w:t>
             </w:r>
-            <w:proofErr w:type="gramEnd"/>
             <w:r>
               <w:rPr>
                 <w:rFonts w:ascii="TH Sarabun New" w:eastAsia="Times New Roman" w:hAnsi="TH Sarabun New" w:cs="TH Sarabun New"/>
@@ -1715,7 +1585,6 @@
               </w:rPr>
               <w:t>{{</w:t>
             </w:r>
-            <w:proofErr w:type="spellStart"/>
             <w:r>
               <w:rPr>
                 <w:rFonts w:ascii="TH Sarabun New" w:eastAsia="Times New Roman" w:hAnsi="TH Sarabun New" w:cs="TH Sarabun New"/>
@@ -1725,7 +1594,6 @@
               </w:rPr>
               <w:t>dean_comment</w:t>
             </w:r>
-            <w:proofErr w:type="spellEnd"/>
             <w:r>
               <w:rPr>
                 <w:rFonts w:ascii="TH Sarabun New" w:eastAsia="Times New Roman" w:hAnsi="TH Sarabun New" w:cs="TH Sarabun New"/>
@@ -1735,46 +1603,6 @@
               </w:rPr>
               <w:t>}}</w:t>
             </w:r>
-          </w:p>
-          <w:p>
-            <w:pPr>
-              <w:rPr>
-                <w:rFonts w:ascii="TH Sarabun New" w:eastAsia="Times New Roman" w:hAnsi="TH Sarabun New" w:cs="TH Sarabun New"/>
-                <w:sz w:val="28"/>
-                <w:szCs w:val="28"/>
-                <w:lang w:val="en-US" w:eastAsia="en-GB"/>
-              </w:rPr>
-            </w:pPr>
-          </w:p>
-          <w:p>
-            <w:pPr>
-              <w:rPr>
-                <w:rFonts w:ascii="TH Sarabun New" w:eastAsia="Times New Roman" w:hAnsi="TH Sarabun New" w:cs="TH Sarabun New"/>
-                <w:sz w:val="28"/>
-                <w:szCs w:val="28"/>
-                <w:lang w:val="en-US" w:eastAsia="en-GB"/>
-              </w:rPr>
-            </w:pPr>
-          </w:p>
-          <w:p>
-            <w:pPr>
-              <w:rPr>
-                <w:rFonts w:ascii="TH Sarabun New" w:eastAsia="Times New Roman" w:hAnsi="TH Sarabun New" w:cs="TH Sarabun New"/>
-                <w:sz w:val="28"/>
-                <w:szCs w:val="28"/>
-                <w:lang w:val="en-US" w:eastAsia="en-GB"/>
-              </w:rPr>
-            </w:pPr>
-          </w:p>
-          <w:p>
-            <w:pPr>
-              <w:rPr>
-                <w:rFonts w:ascii="TH Sarabun New" w:eastAsia="Times New Roman" w:hAnsi="TH Sarabun New" w:cs="TH Sarabun New"/>
-                <w:sz w:val="28"/>
-                <w:szCs w:val="28"/>
-                <w:lang w:val="en-US" w:eastAsia="en-GB"/>
-              </w:rPr>
-            </w:pPr>
           </w:p>
           <w:p>
             <w:pPr>
@@ -1806,7 +1634,6 @@
               </w:rPr>
               <w:t>{{</w:t>
             </w:r>
-            <w:proofErr w:type="spellStart"/>
             <w:r>
               <w:rPr>
                 <w:rFonts w:ascii="TH Sarabun New" w:eastAsia="Times New Roman" w:hAnsi="TH Sarabun New" w:cs="TH Sarabun New"/>
@@ -1816,7 +1643,6 @@
               </w:rPr>
               <w:t>dean_name</w:t>
             </w:r>
-            <w:proofErr w:type="spellEnd"/>
             <w:r>
               <w:rPr>
                 <w:rFonts w:ascii="TH Sarabun New" w:eastAsia="Times New Roman" w:hAnsi="TH Sarabun New" w:cs="TH Sarabun New"/>
@@ -1855,27 +1681,7 @@
                 <w:szCs w:val="28"/>
                 <w:lang w:val="en-US" w:eastAsia="en-GB"/>
               </w:rPr>
-              <w:t>{{</w:t>
-            </w:r>
-            <w:proofErr w:type="spellStart"/>
-            <w:r>
-              <w:rPr>
-                <w:rFonts w:ascii="TH Sarabun New" w:eastAsia="Times New Roman" w:hAnsi="TH Sarabun New" w:cs="TH Sarabun New"/>
-                <w:sz w:val="28"/>
-                <w:szCs w:val="28"/>
-                <w:lang w:val="en-US" w:eastAsia="en-GB"/>
-              </w:rPr>
-              <w:t>dropdownDean</w:t>
-            </w:r>
-            <w:proofErr w:type="spellEnd"/>
-            <w:r>
-              <w:rPr>
-                <w:rFonts w:ascii="TH Sarabun New" w:eastAsia="Times New Roman" w:hAnsi="TH Sarabun New" w:cs="TH Sarabun New"/>
-                <w:sz w:val="28"/>
-                <w:szCs w:val="28"/>
-                <w:lang w:val="en-US" w:eastAsia="en-GB"/>
-              </w:rPr>
-              <w:t>}}</w:t>
+              <w:t>{{dropdownDean}}</w:t>
             </w:r>
             <w:r>
               <w:rPr>
@@ -1916,7 +1722,7 @@
 </file>
 
 <file path=word/endnotes.xml><?xml version="1.0" encoding="utf-8"?>
-<w:endnotes xmlns:wpc="http://schemas.microsoft.com/office/word/2010/wordprocessingCanvas" xmlns:cx="http://schemas.microsoft.com/office/drawing/2014/chartex" xmlns:cx1="http://schemas.microsoft.com/office/drawing/2015/9/8/chartex" xmlns:cx2="http://schemas.microsoft.com/office/drawing/2015/10/21/chartex" xmlns:cx3="http://schemas.microsoft.com/office/drawing/2016/5/9/chartex" xmlns:cx4="http://schemas.microsoft.com/office/drawing/2016/5/10/chartex" xmlns:cx5="http://schemas.microsoft.com/office/drawing/2016/5/11/chartex" xmlns:cx6="http://schemas.microsoft.com/office/drawing/2016/5/12/chartex" xmlns:cx7="http://schemas.microsoft.com/office/drawing/2016/5/13/chartex" xmlns:cx8="http://schemas.microsoft.com/office/drawing/2016/5/14/chartex" xmlns:mc="http://schemas.openxmlformats.org/markup-compatibility/2006" xmlns:m="http://schemas.openxmlformats.org/officeDocument/2006/math" xmlns:aink="http://schemas.microsoft.com/office/drawing/2016/ink" xmlns:am3d="http://schemas.microsoft.com/office/drawing/2017/model3d" xmlns:oel="http://schemas.microsoft.com/office/2019/extlst" xmlns:r="http://schemas.openxmlformats.org/officeDocument/2006/relationships" xmlns:wp14="http://schemas.microsoft.com/office/word/2010/wordprocessingDrawing" xmlns:wp="http://schemas.openxmlformats.org/drawingml/2006/wordprocessingDrawing" xmlns:wpg="http://schemas.microsoft.com/office/word/2010/wordprocessingGroup" xmlns:wpi="http://schemas.microsoft.com/office/word/2010/wordprocessingInk" xmlns:wps="http://schemas.microsoft.com/office/word/2010/wordprocessingShape" xmlns:o="urn:schemas-microsoft-com:office:office" xmlns:v="urn:schemas-microsoft-com:vml" xmlns:w10="urn:schemas-microsoft-com:office:word" xmlns:w="http://schemas.openxmlformats.org/wordprocessingml/2006/main" xmlns:w14="http://schemas.microsoft.com/office/word/2010/wordml" xmlns:w15="http://schemas.microsoft.com/office/word/2012/wordml" xmlns:w16cex="http://schemas.microsoft.com/office/word/2018/wordml/cex" xmlns:w16cid="http://schemas.microsoft.com/office/word/2016/wordml/cid" xmlns:w16="http://schemas.microsoft.com/office/word/2018/wordml" xmlns:w16sdtdh="http://schemas.microsoft.com/office/word/2020/wordml/sdtdatahash" xmlns:w16sdtfl="http://schemas.microsoft.com/office/word/2024/wordml/sdtformatlock" xmlns:w16se="http://schemas.microsoft.com/office/word/2015/wordml/symex" xmlns:w16du="http://schemas.microsoft.com/office/word/2023/wordml/word16du" xmlns:wne="http://schemas.microsoft.com/office/word/2006/wordml" mc:Ignorable="w14 w15 w16se w16cid w16 w16cex w16sdtdh w16sdtfl w16du wp14">
+<w:endnotes xmlns:wpc="http://schemas.microsoft.com/office/word/2010/wordprocessingCanvas" xmlns:cx="http://schemas.microsoft.com/office/drawing/2014/chartex" xmlns:cx1="http://schemas.microsoft.com/office/drawing/2015/9/8/chartex" xmlns:cx2="http://schemas.microsoft.com/office/drawing/2015/10/21/chartex" xmlns:cx3="http://schemas.microsoft.com/office/drawing/2016/5/9/chartex" xmlns:cx4="http://schemas.microsoft.com/office/drawing/2016/5/10/chartex" xmlns:cx5="http://schemas.microsoft.com/office/drawing/2016/5/11/chartex" xmlns:cx6="http://schemas.microsoft.com/office/drawing/2016/5/12/chartex" xmlns:cx7="http://schemas.microsoft.com/office/drawing/2016/5/13/chartex" xmlns:cx8="http://schemas.microsoft.com/office/drawing/2016/5/14/chartex" xmlns:mc="http://schemas.openxmlformats.org/markup-compatibility/2006" xmlns:aink="http://schemas.microsoft.com/office/drawing/2016/ink" xmlns:am3d="http://schemas.microsoft.com/office/drawing/2017/model3d" xmlns:o="urn:schemas-microsoft-com:office:office" xmlns:oel="http://schemas.microsoft.com/office/2019/extlst" xmlns:r="http://schemas.openxmlformats.org/officeDocument/2006/relationships" xmlns:m="http://schemas.openxmlformats.org/officeDocument/2006/math" xmlns:v="urn:schemas-microsoft-com:vml" xmlns:wp14="http://schemas.microsoft.com/office/word/2010/wordprocessingDrawing" xmlns:wp="http://schemas.openxmlformats.org/drawingml/2006/wordprocessingDrawing" xmlns:w10="urn:schemas-microsoft-com:office:word" xmlns:w="http://schemas.openxmlformats.org/wordprocessingml/2006/main" xmlns:w14="http://schemas.microsoft.com/office/word/2010/wordml" xmlns:w15="http://schemas.microsoft.com/office/word/2012/wordml" xmlns:w16cex="http://schemas.microsoft.com/office/word/2018/wordml/cex" xmlns:w16cid="http://schemas.microsoft.com/office/word/2016/wordml/cid" xmlns:w16="http://schemas.microsoft.com/office/word/2018/wordml" xmlns:w16du="http://schemas.microsoft.com/office/word/2023/wordml/word16du" xmlns:w16sdtdh="http://schemas.microsoft.com/office/word/2020/wordml/sdtdatahash" xmlns:w16sdtfl="http://schemas.microsoft.com/office/word/2024/wordml/sdtformatlock" xmlns:w16se="http://schemas.microsoft.com/office/word/2015/wordml/symex" xmlns:wpg="http://schemas.microsoft.com/office/word/2010/wordprocessingGroup" xmlns:wpi="http://schemas.microsoft.com/office/word/2010/wordprocessingInk" xmlns:wne="http://schemas.microsoft.com/office/word/2006/wordml" xmlns:wps="http://schemas.microsoft.com/office/word/2010/wordprocessingShape" mc:Ignorable="w14 w15 w16se w16cid w16 w16cex w16sdtdh w16sdtfl w16du wp14">
   <w:endnote w:type="separator" w:id="-1">
     <w:p>
       <w:r>
@@ -1935,7 +1741,7 @@
 </file>
 
 <file path=word/footnotes.xml><?xml version="1.0" encoding="utf-8"?>
-<w:footnotes xmlns:wpc="http://schemas.microsoft.com/office/word/2010/wordprocessingCanvas" xmlns:cx="http://schemas.microsoft.com/office/drawing/2014/chartex" xmlns:cx1="http://schemas.microsoft.com/office/drawing/2015/9/8/chartex" xmlns:cx2="http://schemas.microsoft.com/office/drawing/2015/10/21/chartex" xmlns:cx3="http://schemas.microsoft.com/office/drawing/2016/5/9/chartex" xmlns:cx4="http://schemas.microsoft.com/office/drawing/2016/5/10/chartex" xmlns:cx5="http://schemas.microsoft.com/office/drawing/2016/5/11/chartex" xmlns:cx6="http://schemas.microsoft.com/office/drawing/2016/5/12/chartex" xmlns:cx7="http://schemas.microsoft.com/office/drawing/2016/5/13/chartex" xmlns:cx8="http://schemas.microsoft.com/office/drawing/2016/5/14/chartex" xmlns:mc="http://schemas.openxmlformats.org/markup-compatibility/2006" xmlns:m="http://schemas.openxmlformats.org/officeDocument/2006/math" xmlns:aink="http://schemas.microsoft.com/office/drawing/2016/ink" xmlns:am3d="http://schemas.microsoft.com/office/drawing/2017/model3d" xmlns:oel="http://schemas.microsoft.com/office/2019/extlst" xmlns:r="http://schemas.openxmlformats.org/officeDocument/2006/relationships" xmlns:wp14="http://schemas.microsoft.com/office/word/2010/wordprocessingDrawing" xmlns:wp="http://schemas.openxmlformats.org/drawingml/2006/wordprocessingDrawing" xmlns:wpg="http://schemas.microsoft.com/office/word/2010/wordprocessingGroup" xmlns:wpi="http://schemas.microsoft.com/office/word/2010/wordprocessingInk" xmlns:wps="http://schemas.microsoft.com/office/word/2010/wordprocessingShape" xmlns:o="urn:schemas-microsoft-com:office:office" xmlns:v="urn:schemas-microsoft-com:vml" xmlns:w10="urn:schemas-microsoft-com:office:word" xmlns:w="http://schemas.openxmlformats.org/wordprocessingml/2006/main" xmlns:w14="http://schemas.microsoft.com/office/word/2010/wordml" xmlns:w15="http://schemas.microsoft.com/office/word/2012/wordml" xmlns:w16cex="http://schemas.microsoft.com/office/word/2018/wordml/cex" xmlns:w16cid="http://schemas.microsoft.com/office/word/2016/wordml/cid" xmlns:w16="http://schemas.microsoft.com/office/word/2018/wordml" xmlns:w16sdtdh="http://schemas.microsoft.com/office/word/2020/wordml/sdtdatahash" xmlns:w16sdtfl="http://schemas.microsoft.com/office/word/2024/wordml/sdtformatlock" xmlns:w16se="http://schemas.microsoft.com/office/word/2015/wordml/symex" xmlns:w16du="http://schemas.microsoft.com/office/word/2023/wordml/word16du" xmlns:wne="http://schemas.microsoft.com/office/word/2006/wordml" mc:Ignorable="w14 w15 w16se w16cid w16 w16cex w16sdtdh w16sdtfl w16du wp14">
+<w:footnotes xmlns:wpc="http://schemas.microsoft.com/office/word/2010/wordprocessingCanvas" xmlns:cx="http://schemas.microsoft.com/office/drawing/2014/chartex" xmlns:cx1="http://schemas.microsoft.com/office/drawing/2015/9/8/chartex" xmlns:cx2="http://schemas.microsoft.com/office/drawing/2015/10/21/chartex" xmlns:cx3="http://schemas.microsoft.com/office/drawing/2016/5/9/chartex" xmlns:cx4="http://schemas.microsoft.com/office/drawing/2016/5/10/chartex" xmlns:cx5="http://schemas.microsoft.com/office/drawing/2016/5/11/chartex" xmlns:cx6="http://schemas.microsoft.com/office/drawing/2016/5/12/chartex" xmlns:cx7="http://schemas.microsoft.com/office/drawing/2016/5/13/chartex" xmlns:cx8="http://schemas.microsoft.com/office/drawing/2016/5/14/chartex" xmlns:mc="http://schemas.openxmlformats.org/markup-compatibility/2006" xmlns:aink="http://schemas.microsoft.com/office/drawing/2016/ink" xmlns:am3d="http://schemas.microsoft.com/office/drawing/2017/model3d" xmlns:o="urn:schemas-microsoft-com:office:office" xmlns:oel="http://schemas.microsoft.com/office/2019/extlst" xmlns:r="http://schemas.openxmlformats.org/officeDocument/2006/relationships" xmlns:m="http://schemas.openxmlformats.org/officeDocument/2006/math" xmlns:v="urn:schemas-microsoft-com:vml" xmlns:wp14="http://schemas.microsoft.com/office/word/2010/wordprocessingDrawing" xmlns:wp="http://schemas.openxmlformats.org/drawingml/2006/wordprocessingDrawing" xmlns:w10="urn:schemas-microsoft-com:office:word" xmlns:w="http://schemas.openxmlformats.org/wordprocessingml/2006/main" xmlns:w14="http://schemas.microsoft.com/office/word/2010/wordml" xmlns:w15="http://schemas.microsoft.com/office/word/2012/wordml" xmlns:w16cex="http://schemas.microsoft.com/office/word/2018/wordml/cex" xmlns:w16cid="http://schemas.microsoft.com/office/word/2016/wordml/cid" xmlns:w16="http://schemas.microsoft.com/office/word/2018/wordml" xmlns:w16du="http://schemas.microsoft.com/office/word/2023/wordml/word16du" xmlns:w16sdtdh="http://schemas.microsoft.com/office/word/2020/wordml/sdtdatahash" xmlns:w16sdtfl="http://schemas.microsoft.com/office/word/2024/wordml/sdtformatlock" xmlns:w16se="http://schemas.microsoft.com/office/word/2015/wordml/symex" xmlns:wpg="http://schemas.microsoft.com/office/word/2010/wordprocessingGroup" xmlns:wpi="http://schemas.microsoft.com/office/word/2010/wordprocessingInk" xmlns:wne="http://schemas.microsoft.com/office/word/2006/wordml" xmlns:wps="http://schemas.microsoft.com/office/word/2010/wordprocessingShape" mc:Ignorable="w14 w15 w16se w16cid w16 w16cex w16sdtdh w16sdtfl w16du wp14">
   <w:footnote w:type="separator" w:id="-1">
     <w:p>
       <w:r>
@@ -1954,7 +1760,7 @@
 </file>
 
 <file path=word/styles.xml><?xml version="1.0" encoding="utf-8"?>
-<w:styles xmlns:mc="http://schemas.openxmlformats.org/markup-compatibility/2006" xmlns:r="http://schemas.openxmlformats.org/officeDocument/2006/relationships" xmlns:w="http://schemas.openxmlformats.org/wordprocessingml/2006/main" xmlns:w14="http://schemas.microsoft.com/office/word/2010/wordml" xmlns:w15="http://schemas.microsoft.com/office/word/2012/wordml" xmlns:w16cex="http://schemas.microsoft.com/office/word/2018/wordml/cex" xmlns:w16cid="http://schemas.microsoft.com/office/word/2016/wordml/cid" xmlns:w16="http://schemas.microsoft.com/office/word/2018/wordml" xmlns:w16sdtdh="http://schemas.microsoft.com/office/word/2020/wordml/sdtdatahash" xmlns:w16sdtfl="http://schemas.microsoft.com/office/word/2024/wordml/sdtformatlock" xmlns:w16se="http://schemas.microsoft.com/office/word/2015/wordml/symex" xmlns:w16du="http://schemas.microsoft.com/office/word/2023/wordml/word16du" mc:Ignorable="w14 w15 w16se w16cid w16 w16cex w16sdtdh w16sdtfl w16du">
+<w:styles xmlns:mc="http://schemas.openxmlformats.org/markup-compatibility/2006" xmlns:r="http://schemas.openxmlformats.org/officeDocument/2006/relationships" xmlns:w="http://schemas.openxmlformats.org/wordprocessingml/2006/main" xmlns:w14="http://schemas.microsoft.com/office/word/2010/wordml" xmlns:w15="http://schemas.microsoft.com/office/word/2012/wordml" xmlns:w16cex="http://schemas.microsoft.com/office/word/2018/wordml/cex" xmlns:w16cid="http://schemas.microsoft.com/office/word/2016/wordml/cid" xmlns:w16="http://schemas.microsoft.com/office/word/2018/wordml" xmlns:w16du="http://schemas.microsoft.com/office/word/2023/wordml/word16du" xmlns:w16sdtdh="http://schemas.microsoft.com/office/word/2020/wordml/sdtdatahash" xmlns:w16sdtfl="http://schemas.microsoft.com/office/word/2024/wordml/sdtformatlock" xmlns:w16se="http://schemas.microsoft.com/office/word/2015/wordml/symex" mc:Ignorable="w14 w15 w16se w16cid w16 w16cex w16sdtdh w16sdtfl w16du">
   <w:docDefaults>
     <w:rPrDefault>
       <w:rPr>

</xml_diff>

<commit_message>
Lock carried fields in doc 4 and fix PDF reserve
Document 4 now treats applicant and committee fields as carried data from docs 1 and 3: the form renders them read-only, POST tampering is overridden server-side, and a new MVC test verifies both behavior paths. The PDF builder was hardened to handle inline reserve wrapping/misalignment more reliably, and related UI updates improve read-only styling, signer-credential toggling when returning for edits, and person picker race/reopen behavior.
</commit_message>
<xml_diff>
--- a/HRCP-KKU-Academic/src/main/resources/templates/docx/doc_3.docx
+++ b/HRCP-KKU-Academic/src/main/resources/templates/docx/doc_3.docx
@@ -135,7 +135,7 @@
                 <w:cs/>
                 <w:lang w:val="en-US" w:eastAsia="en-GB"/>
               </w:rPr>
-              <w:t xml:space="preserve">(  </w:t>
+              <w:t xml:space="preserve">( </w:t>
             </w:r>
             <w:r>
               <w:rPr>
@@ -328,7 +328,7 @@
             <w:pPr>
               <w:jc w:val="thaiDistribute"/>
               <w:rPr>
-                <w:rFonts w:ascii="TH Sarabun New" w:eastAsia="Times New Roman" w:hAnsi="TH Sarabun New" w:cs="TH Sarabun New" w:hint="cs"/>
+                <w:rFonts w:ascii="TH Sarabun New" w:eastAsia="Times New Roman" w:hAnsi="TH Sarabun New" w:cs="TH Sarabun New"/>
                 <w:sz w:val="28"/>
                 <w:szCs w:val="28"/>
                 <w:lang w:val="en-US" w:eastAsia="en-GB"/>
@@ -342,7 +342,7 @@
                 <w:cs/>
                 <w:lang w:val="en-US" w:eastAsia="en-GB"/>
               </w:rPr>
-              <w:t xml:space="preserve">(  </w:t>
+              <w:t xml:space="preserve">( </w:t>
             </w:r>
             <w:r>
               <w:rPr>
@@ -957,7 +957,17 @@
                 <w:cs/>
                 <w:lang w:val="en-US" w:eastAsia="en-GB"/>
               </w:rPr>
-              <w:t xml:space="preserve">( </w:t>
+              <w:t>(</w:t>
+            </w:r>
+            <w:r>
+              <w:rPr>
+                <w:rFonts w:ascii="TH Sarabun New" w:eastAsia="Times New Roman" w:hAnsi="TH Sarabun New" w:cs="TH Sarabun New" w:hint="cs"/>
+                <w:sz w:val="28"/>
+                <w:szCs w:val="28"/>
+                <w:cs/>
+                <w:lang w:val="en-US" w:eastAsia="en-GB"/>
+              </w:rPr>
+              <w:t xml:space="preserve"> </w:t>
             </w:r>
             <w:r>
               <w:rPr>
@@ -994,7 +1004,27 @@
                 <w:cs/>
                 <w:lang w:val="en-US" w:eastAsia="en-GB"/>
               </w:rPr>
-              <w:t xml:space="preserve">  )  เพื่อโปรดพิจารณา</w:t>
+              <w:t xml:space="preserve"> </w:t>
+            </w:r>
+            <w:r>
+              <w:rPr>
+                <w:rFonts w:ascii="TH Sarabun New" w:eastAsia="Times New Roman" w:hAnsi="TH Sarabun New" w:cs="TH Sarabun New" w:hint="cs"/>
+                <w:sz w:val="28"/>
+                <w:szCs w:val="28"/>
+                <w:cs/>
+                <w:lang w:val="en-US" w:eastAsia="en-GB"/>
+              </w:rPr>
+              <w:t xml:space="preserve"> </w:t>
+            </w:r>
+            <w:r>
+              <w:rPr>
+                <w:rFonts w:ascii="TH Sarabun New" w:eastAsia="Times New Roman" w:hAnsi="TH Sarabun New" w:cs="TH Sarabun New" w:hint="cs"/>
+                <w:sz w:val="28"/>
+                <w:szCs w:val="28"/>
+                <w:cs/>
+                <w:lang w:val="en-US" w:eastAsia="en-GB"/>
+              </w:rPr>
+              <w:t>)  เพื่อโปรดพิจารณา</w:t>
             </w:r>
           </w:p>
           <w:p>
@@ -1065,13 +1095,31 @@
             </w:r>
             <w:r>
               <w:rPr>
-                <w:rFonts w:ascii="TH Sarabun New" w:eastAsia="Times New Roman" w:hAnsi="TH Sarabun New" w:cs="TH Sarabun New" w:hint="cs"/>
-                <w:sz w:val="28"/>
-                <w:szCs w:val="28"/>
-                <w:cs/>
-                <w:lang w:val="en-US" w:eastAsia="en-GB"/>
-              </w:rPr>
-              <w:t xml:space="preserve">  )  เห็นควรแต่งตั้งคณะอนุกรรมการประเมิน จำนวน 3 รายชื่อ ดังนี้</w:t>
+                <w:rFonts w:ascii="TH Sarabun New" w:eastAsia="Times New Roman" w:hAnsi="TH Sarabun New" w:cs="TH Sarabun New"/>
+                <w:sz w:val="28"/>
+                <w:szCs w:val="28"/>
+                <w:lang w:val="en-US" w:eastAsia="en-GB"/>
+              </w:rPr>
+              <w:t xml:space="preserve"> </w:t>
+            </w:r>
+            <w:r>
+              <w:rPr>
+                <w:rFonts w:ascii="TH Sarabun New" w:eastAsia="Times New Roman" w:hAnsi="TH Sarabun New" w:cs="TH Sarabun New"/>
+                <w:sz w:val="28"/>
+                <w:szCs w:val="28"/>
+                <w:lang w:val="en-US" w:eastAsia="en-GB"/>
+              </w:rPr>
+              <w:t xml:space="preserve"> </w:t>
+            </w:r>
+            <w:r>
+              <w:rPr>
+                <w:rFonts w:ascii="TH Sarabun New" w:eastAsia="Times New Roman" w:hAnsi="TH Sarabun New" w:cs="TH Sarabun New" w:hint="cs"/>
+                <w:sz w:val="28"/>
+                <w:szCs w:val="28"/>
+                <w:cs/>
+                <w:lang w:val="en-US" w:eastAsia="en-GB"/>
+              </w:rPr>
+              <w:t>)  เห็นควรแต่งตั้งคณะอนุกรรมการประเมิน จำนวน 3 รายชื่อ ดังนี้</w:t>
             </w:r>
           </w:p>
           <w:p>
@@ -1486,7 +1534,47 @@
                 <w:cs/>
                 <w:lang w:val="en-US" w:eastAsia="en-GB"/>
               </w:rPr>
-              <w:t xml:space="preserve">  )  เห็นชอบ และดำเนินการนัดวันประเมินผลการสอนต่อไป</w:t>
+              <w:t xml:space="preserve"> </w:t>
+            </w:r>
+            <w:r>
+              <w:rPr>
+                <w:rFonts w:ascii="TH Sarabun New" w:eastAsia="Times New Roman" w:hAnsi="TH Sarabun New" w:cs="TH Sarabun New" w:hint="cs"/>
+                <w:sz w:val="28"/>
+                <w:szCs w:val="28"/>
+                <w:cs/>
+                <w:lang w:val="en-US" w:eastAsia="en-GB"/>
+              </w:rPr>
+              <w:t xml:space="preserve"> </w:t>
+            </w:r>
+            <w:r>
+              <w:rPr>
+                <w:rFonts w:ascii="TH Sarabun New" w:eastAsia="Times New Roman" w:hAnsi="TH Sarabun New" w:cs="TH Sarabun New" w:hint="cs"/>
+                <w:sz w:val="28"/>
+                <w:szCs w:val="28"/>
+                <w:cs/>
+                <w:lang w:val="en-US" w:eastAsia="en-GB"/>
+              </w:rPr>
+              <w:t xml:space="preserve">) </w:t>
+            </w:r>
+            <w:r>
+              <w:rPr>
+                <w:rFonts w:ascii="TH Sarabun New" w:eastAsia="Times New Roman" w:hAnsi="TH Sarabun New" w:cs="TH Sarabun New" w:hint="cs"/>
+                <w:sz w:val="28"/>
+                <w:szCs w:val="28"/>
+                <w:cs/>
+                <w:lang w:val="en-US" w:eastAsia="en-GB"/>
+              </w:rPr>
+              <w:t xml:space="preserve"> </w:t>
+            </w:r>
+            <w:r>
+              <w:rPr>
+                <w:rFonts w:ascii="TH Sarabun New" w:eastAsia="Times New Roman" w:hAnsi="TH Sarabun New" w:cs="TH Sarabun New" w:hint="cs"/>
+                <w:sz w:val="28"/>
+                <w:szCs w:val="28"/>
+                <w:cs/>
+                <w:lang w:val="en-US" w:eastAsia="en-GB"/>
+              </w:rPr>
+              <w:t>เห็นชอบ และดำเนินการนัดวันประเมินผลการสอนต่อไป</w:t>
             </w:r>
           </w:p>
           <w:p>
@@ -1564,7 +1652,21 @@
                 <w:rFonts w:ascii="TH Sarabun New" w:hAnsi="TH Sarabun New" w:cs="TH Sarabun New"/>
                 <w:lang w:val="en-US" w:eastAsia="en-GB"/>
               </w:rPr>
+              <w:t xml:space="preserve"> </w:t>
+            </w:r>
+            <w:r>
+              <w:rPr>
+                <w:rFonts w:ascii="TH Sarabun New" w:hAnsi="TH Sarabun New" w:cs="TH Sarabun New"/>
+                <w:lang w:val="en-US" w:eastAsia="en-GB"/>
+              </w:rPr>
               <w:t>)</w:t>
+            </w:r>
+            <w:r>
+              <w:rPr>
+                <w:rFonts w:ascii="TH Sarabun New" w:hAnsi="TH Sarabun New" w:cs="TH Sarabun New"/>
+                <w:lang w:val="en-US" w:eastAsia="en-GB"/>
+              </w:rPr>
+              <w:t xml:space="preserve"> </w:t>
             </w:r>
             <w:r>
               <w:rPr>

</xml_diff>